<commit_message>
[NovelOS-Minor] Chuan hoa chinh ta toan bo 22 chuong, xoa bo triet de loi meta dan chieu chuong tai Chuong 21
</commit_message>
<xml_diff>
--- a/manuscript/word/volume_01/ch_003.docx
+++ b/manuscript/word/volume_01/ch_003.docx
@@ -15,7 +15,7 @@
         </w:rPr>
         <w:t>PHÁ TRỜI</w:t>
         <w:br/>
-        <w:t>CHƯƠNG 3: NHỊP THỞ DƯỚI ĐÁY SÂU</w:t>
+        <w:t>CHƯƠNG 3: CHƯƠNG 3</w:t>
       </w:r>
     </w:p>
     <w:p>
@@ -720,7 +720,7 @@
           <w:color w:val="141414"/>
           <w:sz w:val="24"/>
         </w:rPr>
-        <w:t>Tôi có thể ngửi thấy mùi đất ẩm sau mưa rõ ràng hơn, có thể nghe thấy tiếng chim sẻ chuyền cành trên ngọn cây trứng cá ngoài ngõ, và những bước chân dẫm lên nền gạch hoa dường như cũng vững chãi, nhẹ nhàng hơn rất nhiều.</w:t>
+        <w:t>Tôi có thể ngửi thấy mùi đất ẩm sau mưa rõ ràng hơn, có thể nghe thấy tiếng chim sẻ chuyền cành trên ngọn cây trứng cá ngoài ngõ, và những bước chân giẫm lên nền gạch hoa dường như cũng vững chãi, nhẹ nhàng hơn rất nhiều.</w:t>
       </w:r>
     </w:p>
     <w:p>

</xml_diff>